<commit_message>
chore: updated solution to .NET 10 (#90)
* Updated to slnx
* Default targetframework to .NET 10
* Open Word automatically when available
* Bumped version
* Simplified Tutorial sample.
* Updated TODO and README
* Added Solution Items to solution
* Updated vscode launch and tasks
* Updated NuGet packages
* Updated samples
* Updated nuspec
</commit_message>
<xml_diff>
--- a/Samples/Documents/Inheritance.docx
+++ b/Samples/Documents/Inheritance.docx
@@ -1,6 +1,6 @@
 
 <file path=word/document.xml><?xml version="1.0" encoding="utf-8"?>
-<w:document xmlns:a="http://schemas.openxmlformats.org/drawingml/2006/main" xmlns:a14="http://schemas.microsoft.com/office/drawing/2010/main" xmlns:pic="http://schemas.openxmlformats.org/drawingml/2006/picture" xmlns:wpc="http://schemas.microsoft.com/office/word/2010/wordprocessingCanvas" xmlns:cx="http://schemas.microsoft.com/office/drawing/2014/chartex" xmlns:cx1="http://schemas.microsoft.com/office/drawing/2015/9/8/chartex" xmlns:cx2="http://schemas.microsoft.com/office/drawing/2015/10/21/chartex" xmlns:cx3="http://schemas.microsoft.com/office/drawing/2016/5/9/chartex" xmlns:cx4="http://schemas.microsoft.com/office/drawing/2016/5/10/chartex" xmlns:cx5="http://schemas.microsoft.com/office/drawing/2016/5/11/chartex" xmlns:cx6="http://schemas.microsoft.com/office/drawing/2016/5/12/chartex" xmlns:cx7="http://schemas.microsoft.com/office/drawing/2016/5/13/chartex" xmlns:cx8="http://schemas.microsoft.com/office/drawing/2016/5/14/chartex" xmlns:mc="http://schemas.openxmlformats.org/markup-compatibility/2006" xmlns:aink="http://schemas.microsoft.com/office/drawing/2016/ink" xmlns:am3d="http://schemas.microsoft.com/office/drawing/2017/model3d" xmlns:o="urn:schemas-microsoft-com:office:office" xmlns:oel="http://schemas.microsoft.com/office/2019/extlst" xmlns:r="http://schemas.openxmlformats.org/officeDocument/2006/relationships" xmlns:m="http://schemas.openxmlformats.org/officeDocument/2006/math" xmlns:v="urn:schemas-microsoft-com:vml" xmlns:wp14="http://schemas.microsoft.com/office/word/2010/wordprocessingDrawing" xmlns:wp="http://schemas.openxmlformats.org/drawingml/2006/wordprocessingDrawing" xmlns:w10="urn:schemas-microsoft-com:office:word" xmlns:w="http://schemas.openxmlformats.org/wordprocessingml/2006/main" xmlns:w14="http://schemas.microsoft.com/office/word/2010/wordml" xmlns:w15="http://schemas.microsoft.com/office/word/2012/wordml" xmlns:w16cex="http://schemas.microsoft.com/office/word/2018/wordml/cex" xmlns:w16cid="http://schemas.microsoft.com/office/word/2016/wordml/cid" xmlns:w16="http://schemas.microsoft.com/office/word/2018/wordml" xmlns:w16du="http://schemas.microsoft.com/office/word/2023/wordml/word16du" xmlns:w16sdtdh="http://schemas.microsoft.com/office/word/2020/wordml/sdtdatahash" xmlns:w16se="http://schemas.microsoft.com/office/word/2015/wordml/symex" xmlns:wpg="http://schemas.microsoft.com/office/word/2010/wordprocessingGroup" xmlns:wpi="http://schemas.microsoft.com/office/word/2010/wordprocessingInk" xmlns:wne="http://schemas.microsoft.com/office/word/2006/wordml" xmlns:wps="http://schemas.microsoft.com/office/word/2010/wordprocessingShape" mc:Ignorable="w14 w15 w16se w16cid w16 w16cex w16sdtdh w16du wp14">
+<w:document xmlns:a="http://schemas.openxmlformats.org/drawingml/2006/main" xmlns:a14="http://schemas.microsoft.com/office/drawing/2010/main" xmlns:pic="http://schemas.openxmlformats.org/drawingml/2006/picture" xmlns:wpc="http://schemas.microsoft.com/office/word/2010/wordprocessingCanvas" xmlns:cx="http://schemas.microsoft.com/office/drawing/2014/chartex" xmlns:cx1="http://schemas.microsoft.com/office/drawing/2015/9/8/chartex" xmlns:cx2="http://schemas.microsoft.com/office/drawing/2015/10/21/chartex" xmlns:cx3="http://schemas.microsoft.com/office/drawing/2016/5/9/chartex" xmlns:cx4="http://schemas.microsoft.com/office/drawing/2016/5/10/chartex" xmlns:cx5="http://schemas.microsoft.com/office/drawing/2016/5/11/chartex" xmlns:cx6="http://schemas.microsoft.com/office/drawing/2016/5/12/chartex" xmlns:cx7="http://schemas.microsoft.com/office/drawing/2016/5/13/chartex" xmlns:cx8="http://schemas.microsoft.com/office/drawing/2016/5/14/chartex" xmlns:mc="http://schemas.openxmlformats.org/markup-compatibility/2006" xmlns:aink="http://schemas.microsoft.com/office/drawing/2016/ink" xmlns:am3d="http://schemas.microsoft.com/office/drawing/2017/model3d" xmlns:o="urn:schemas-microsoft-com:office:office" xmlns:oel="http://schemas.microsoft.com/office/2019/extlst" xmlns:r="http://schemas.openxmlformats.org/officeDocument/2006/relationships" xmlns:m="http://schemas.openxmlformats.org/officeDocument/2006/math" xmlns:v="urn:schemas-microsoft-com:vml" xmlns:wp14="http://schemas.microsoft.com/office/word/2010/wordprocessingDrawing" xmlns:wp="http://schemas.openxmlformats.org/drawingml/2006/wordprocessingDrawing" xmlns:w10="urn:schemas-microsoft-com:office:word" xmlns:w="http://schemas.openxmlformats.org/wordprocessingml/2006/main" xmlns:w14="http://schemas.microsoft.com/office/word/2010/wordml" xmlns:w15="http://schemas.microsoft.com/office/word/2012/wordml" xmlns:w16cex="http://schemas.microsoft.com/office/word/2018/wordml/cex" xmlns:w16cid="http://schemas.microsoft.com/office/word/2016/wordml/cid" xmlns:w16="http://schemas.microsoft.com/office/word/2018/wordml" xmlns:w16du="http://schemas.microsoft.com/office/word/2023/wordml/word16du" xmlns:w16sdtdh="http://schemas.microsoft.com/office/word/2020/wordml/sdtdatahash" xmlns:w16sdtfl="http://schemas.microsoft.com/office/word/2024/wordml/sdtformatlock" xmlns:w16se="http://schemas.microsoft.com/office/word/2015/wordml/symex" xmlns:wpg="http://schemas.microsoft.com/office/word/2010/wordprocessingGroup" xmlns:wpi="http://schemas.microsoft.com/office/word/2010/wordprocessingInk" xmlns:wne="http://schemas.microsoft.com/office/word/2006/wordml" xmlns:wps="http://schemas.microsoft.com/office/word/2010/wordprocessingShape" mc:Ignorable="w14 w15 w16se w16cid w16 w16cex w16sdtdh w16sdtfl w16du wp14">
   <w:body>
     <w:sdt>
       <w:sdtPr>
@@ -253,7 +253,7 @@
                                     <w:t xml:space="preserve"/>
                                     <w:t xml:space="preserve"/>
                                   </w:r>
-                                  <w:hyperlink w:history="true" r:id="rd3f5962cd5ca478dbcd4e5e521bbf0c7">
+                                  <w:hyperlink w:history="true" r:id="rf49c5d51606b4f40b32a3bc96093aa5d">
                                     <w:r>
                                       <w:rPr>
                                         <w:rStyle w:val="Hyperlink"/>
@@ -299,7 +299,7 @@
                                     <w:t xml:space="preserve"/>
                                     <w:t xml:space="preserve"/>
                                   </w:r>
-                                  <w:hyperlink w:history="true" r:id="r022bb0b07f4644cf9140257ae2551b7b">
+                                  <w:hyperlink w:history="true" r:id="r0e163f94333d47b6a646fcecdf2bc730">
                                     <w:r>
                                       <w:rPr>
                                         <w:rStyle w:val="Hyperlink"/>
@@ -507,7 +507,7 @@
                                     <w:t xml:space="preserve">have a look at the </w:t>
                                     <w:t xml:space="preserve"/>
                                   </w:r>
-                                  <w:hyperlink w:history="true" r:id="rd4d681e5871146e1ac46f433dc990ce9">
+                                  <w:hyperlink w:history="true" r:id="r51309b60e42941d4ab4abf91a62a5e61">
                                     <w:r>
                                       <w:rPr>
                                         <w:rStyle w:val="Hyperlink"/>
@@ -600,7 +600,7 @@
                               <w:t xml:space="preserve"/>
                               <w:t xml:space="preserve"/>
                             </w:r>
-                            <w:hyperlink w:history="true" r:id="r5b5bf8f4a37a4b14b4f97ee1d18c0df3">
+                            <w:hyperlink w:history="true" r:id="r3080039d8588455f9396b232dff23947">
                               <w:r>
                                 <w:rPr>
                                   <w:rStyle w:val="Hyperlink"/>
@@ -646,7 +646,7 @@
                               <w:t xml:space="preserve"/>
                               <w:t xml:space="preserve"/>
                             </w:r>
-                            <w:hyperlink w:history="true" r:id="re8ea17f0d86248a7ab3be5facac18d8f">
+                            <w:hyperlink w:history="true" r:id="r403eb30534f24eb980084a633367933c">
                               <w:r>
                                 <w:rPr>
                                   <w:rStyle w:val="Hyperlink"/>
@@ -854,7 +854,7 @@
                               <w:t xml:space="preserve">have a look at the </w:t>
                               <w:t xml:space="preserve"/>
                             </w:r>
-                            <w:hyperlink w:history="true" r:id="r2872b21de2324151a1eee3127f4a4c31">
+                            <w:hyperlink w:history="true" r:id="r89560073659442f9883cfff2d409a47a">
                               <w:r>
                                 <w:rPr>
                                   <w:rStyle w:val="Hyperlink"/>
@@ -875,24 +875,12 @@
               </mc:Fallback>
             </mc:AlternateContent>
           </w:r>
-          <w:sdt>
-            <w:sdtPr>
-              <w:rPr>
-                <w:lang w:val="en-US"/>
-              </w:rPr>
-              <w:id w:val="633372245"/>
-              <w:dataBinding w:prefixMappings="xmlns:ns0='http://schemas.openxmlformats.org/package/2006/metadata/core-properties' xmlns:ns1='http://purl.org/dc/elements/1.1/'" w:xpath="/ns0:coreProperties[1]/ns1:title[1]" w:storeItemID="{6C3C8BC8-F283-45AE-878A-BAB7291924A1}"/>
-              <w:text/>
-            </w:sdtPr>
-            <w:sdtContent>
-              <w:r>
-                <w:rPr>
-                  <w:lang w:val="en-US"/>
-                </w:rPr>
-                <w:t>Inheritance sample</w:t>
-              </w:r>
-            </w:sdtContent>
-          </w:sdt>
+          <w:r>
+            <w:rPr>
+              <w:lang w:val="en-US"/>
+            </w:rPr>
+            <w:t>Inheritance sample</w:t>
+          </w:r>
         </w:p>
         <w:p>
           <w:pPr>
@@ -901,30 +889,18 @@
               <w:lang w:val="en-US"/>
             </w:rPr>
           </w:pPr>
-          <w:sdt>
-            <w:sdtPr>
-              <w:rPr>
-                <w:lang w:val="en-US"/>
-              </w:rPr>
-              <w:id w:val="1370498214"/>
-              <w:dataBinding w:prefixMappings="xmlns:ns0='http://schemas.openxmlformats.org/package/2006/metadata/core-properties' xmlns:ns1='http://purl.org/dc/elements/1.1/'" w:xpath="/ns0:coreProperties[1]/ns1:subject[1]" w:storeItemID="{6C3C8BC8-F283-45AE-878A-BAB7291924A1}"/>
-              <w:text/>
-            </w:sdtPr>
-            <w:sdtContent>
-              <w:r>
-                <w:rPr>
-                  <w:lang w:val="en-US"/>
-                </w:rPr>
-                <w:t>Create and access custom properties and</w:t>
-              </w:r>
-              <w:r>
-                <w:rPr>
-                  <w:lang w:val="en-US"/>
-                </w:rPr>
-                <w:t xml:space="preserve"> </w:t>
-              </w:r>
-            </w:sdtContent>
-          </w:sdt>
+          <w:r>
+            <w:rPr>
+              <w:lang w:val="en-US"/>
+            </w:rPr>
+            <w:t>Create and access custom properties and</w:t>
+          </w:r>
+          <w:r>
+            <w:rPr>
+              <w:lang w:val="en-US"/>
+            </w:rPr>
+            <w:t xml:space="preserve"> </w:t>
+          </w:r>
           <w:r>
             <w:rPr>
               <w:lang w:val="en-US"/>
@@ -1006,7 +982,7 @@
               </mc:Choice>
               <mc:Fallback>
                 <w:pict>
-                  <v:rect id="Rechthoek 4" style="position:absolute;margin-left:0;margin-top:0;width:538.55pt;height:718.2pt;z-index:251670528;visibility:visible;mso-wrap-style:square;mso-width-percent:1070;mso-height-percent:1050;mso-wrap-distance-left:9pt;mso-wrap-distance-top:0;mso-wrap-distance-right:9pt;mso-wrap-distance-bottom:0;mso-position-horizontal:center;mso-position-horizontal-relative:margin;mso-position-vertical:center;mso-position-vertical-relative:margin;mso-width-percent:1070;mso-height-percent:1050;mso-width-relative:margin;mso-height-relative:margin;v-text-anchor:top" o:spid="_x0000_s1026" filled="f" strokecolor="black [3213]" o:gfxdata="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" w14:anchorId="4E2D69B4">
+                  <v:rect id="Rechthoek 4" style="position:absolute;margin-left:0;margin-top:0;width:538.55pt;height:718.2pt;z-index:251670528;visibility:visible;mso-wrap-style:square;mso-width-percent:1070;mso-height-percent:1050;mso-wrap-distance-left:9pt;mso-wrap-distance-top:0;mso-wrap-distance-right:9pt;mso-wrap-distance-bottom:0;mso-position-horizontal:center;mso-position-horizontal-relative:margin;mso-position-vertical:center;mso-position-vertical-relative:margin;mso-width-percent:1070;mso-height-percent:1050;mso-width-relative:margin;mso-height-relative:margin;v-text-anchor:top" o:spid="_x0000_s1026" filled="f" strokecolor="black [3213]" o:gfxdata="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" w14:anchorId="45A8339B">
                     <w10:wrap anchorx="margin" anchory="margin"/>
                   </v:rect>
                 </w:pict>
@@ -1421,7 +1397,7 @@
 </file>
 
 <file path=word/endnotes.xml><?xml version="1.0" encoding="utf-8"?>
-<w:endnotes xmlns:wpc="http://schemas.microsoft.com/office/word/2010/wordprocessingCanvas" xmlns:cx="http://schemas.microsoft.com/office/drawing/2014/chartex" xmlns:cx1="http://schemas.microsoft.com/office/drawing/2015/9/8/chartex" xmlns:cx2="http://schemas.microsoft.com/office/drawing/2015/10/21/chartex" xmlns:cx3="http://schemas.microsoft.com/office/drawing/2016/5/9/chartex" xmlns:cx4="http://schemas.microsoft.com/office/drawing/2016/5/10/chartex" xmlns:cx5="http://schemas.microsoft.com/office/drawing/2016/5/11/chartex" xmlns:cx6="http://schemas.microsoft.com/office/drawing/2016/5/12/chartex" xmlns:cx7="http://schemas.microsoft.com/office/drawing/2016/5/13/chartex" xmlns:cx8="http://schemas.microsoft.com/office/drawing/2016/5/14/chartex" xmlns:mc="http://schemas.openxmlformats.org/markup-compatibility/2006" xmlns:aink="http://schemas.microsoft.com/office/drawing/2016/ink" xmlns:am3d="http://schemas.microsoft.com/office/drawing/2017/model3d" xmlns:o="urn:schemas-microsoft-com:office:office" xmlns:oel="http://schemas.microsoft.com/office/2019/extlst" xmlns:r="http://schemas.openxmlformats.org/officeDocument/2006/relationships" xmlns:m="http://schemas.openxmlformats.org/officeDocument/2006/math" xmlns:v="urn:schemas-microsoft-com:vml" xmlns:wp14="http://schemas.microsoft.com/office/word/2010/wordprocessingDrawing" xmlns:wp="http://schemas.openxmlformats.org/drawingml/2006/wordprocessingDrawing" xmlns:w10="urn:schemas-microsoft-com:office:word" xmlns:w="http://schemas.openxmlformats.org/wordprocessingml/2006/main" xmlns:w14="http://schemas.microsoft.com/office/word/2010/wordml" xmlns:w15="http://schemas.microsoft.com/office/word/2012/wordml" xmlns:w16cex="http://schemas.microsoft.com/office/word/2018/wordml/cex" xmlns:w16cid="http://schemas.microsoft.com/office/word/2016/wordml/cid" xmlns:w16="http://schemas.microsoft.com/office/word/2018/wordml" xmlns:w16du="http://schemas.microsoft.com/office/word/2023/wordml/word16du" xmlns:w16sdtdh="http://schemas.microsoft.com/office/word/2020/wordml/sdtdatahash" xmlns:w16se="http://schemas.microsoft.com/office/word/2015/wordml/symex" xmlns:wpg="http://schemas.microsoft.com/office/word/2010/wordprocessingGroup" xmlns:wpi="http://schemas.microsoft.com/office/word/2010/wordprocessingInk" xmlns:wne="http://schemas.microsoft.com/office/word/2006/wordml" xmlns:wps="http://schemas.microsoft.com/office/word/2010/wordprocessingShape" mc:Ignorable="w14 w15 w16se w16cid w16 w16cex w16sdtdh w16du wp14">
+<w:endnotes xmlns:wpc="http://schemas.microsoft.com/office/word/2010/wordprocessingCanvas" xmlns:cx="http://schemas.microsoft.com/office/drawing/2014/chartex" xmlns:cx1="http://schemas.microsoft.com/office/drawing/2015/9/8/chartex" xmlns:cx2="http://schemas.microsoft.com/office/drawing/2015/10/21/chartex" xmlns:cx3="http://schemas.microsoft.com/office/drawing/2016/5/9/chartex" xmlns:cx4="http://schemas.microsoft.com/office/drawing/2016/5/10/chartex" xmlns:cx5="http://schemas.microsoft.com/office/drawing/2016/5/11/chartex" xmlns:cx6="http://schemas.microsoft.com/office/drawing/2016/5/12/chartex" xmlns:cx7="http://schemas.microsoft.com/office/drawing/2016/5/13/chartex" xmlns:cx8="http://schemas.microsoft.com/office/drawing/2016/5/14/chartex" xmlns:mc="http://schemas.openxmlformats.org/markup-compatibility/2006" xmlns:aink="http://schemas.microsoft.com/office/drawing/2016/ink" xmlns:am3d="http://schemas.microsoft.com/office/drawing/2017/model3d" xmlns:o="urn:schemas-microsoft-com:office:office" xmlns:oel="http://schemas.microsoft.com/office/2019/extlst" xmlns:r="http://schemas.openxmlformats.org/officeDocument/2006/relationships" xmlns:m="http://schemas.openxmlformats.org/officeDocument/2006/math" xmlns:v="urn:schemas-microsoft-com:vml" xmlns:wp14="http://schemas.microsoft.com/office/word/2010/wordprocessingDrawing" xmlns:wp="http://schemas.openxmlformats.org/drawingml/2006/wordprocessingDrawing" xmlns:w10="urn:schemas-microsoft-com:office:word" xmlns:w="http://schemas.openxmlformats.org/wordprocessingml/2006/main" xmlns:w14="http://schemas.microsoft.com/office/word/2010/wordml" xmlns:w15="http://schemas.microsoft.com/office/word/2012/wordml" xmlns:w16cex="http://schemas.microsoft.com/office/word/2018/wordml/cex" xmlns:w16cid="http://schemas.microsoft.com/office/word/2016/wordml/cid" xmlns:w16="http://schemas.microsoft.com/office/word/2018/wordml" xmlns:w16du="http://schemas.microsoft.com/office/word/2023/wordml/word16du" xmlns:w16sdtdh="http://schemas.microsoft.com/office/word/2020/wordml/sdtdatahash" xmlns:w16sdtfl="http://schemas.microsoft.com/office/word/2024/wordml/sdtformatlock" xmlns:w16se="http://schemas.microsoft.com/office/word/2015/wordml/symex" xmlns:wpg="http://schemas.microsoft.com/office/word/2010/wordprocessingGroup" xmlns:wpi="http://schemas.microsoft.com/office/word/2010/wordprocessingInk" xmlns:wne="http://schemas.microsoft.com/office/word/2006/wordml" xmlns:wps="http://schemas.microsoft.com/office/word/2010/wordprocessingShape" mc:Ignorable="w14 w15 w16se w16cid w16 w16cex w16sdtdh w16sdtfl w16du wp14">
   <w:endnote w:type="separator" w:id="-1">
     <w:p>
       <w:pPr>
@@ -1446,7 +1422,7 @@
 </file>
 
 <file path=word/footer1.xml><?xml version="1.0" encoding="utf-8"?>
-<w:ftr xmlns:a="http://schemas.openxmlformats.org/drawingml/2006/main" xmlns:a14="http://schemas.microsoft.com/office/drawing/2010/main" xmlns:wpc="http://schemas.microsoft.com/office/word/2010/wordprocessingCanvas" xmlns:cx="http://schemas.microsoft.com/office/drawing/2014/chartex" xmlns:cx1="http://schemas.microsoft.com/office/drawing/2015/9/8/chartex" xmlns:cx2="http://schemas.microsoft.com/office/drawing/2015/10/21/chartex" xmlns:cx3="http://schemas.microsoft.com/office/drawing/2016/5/9/chartex" xmlns:cx4="http://schemas.microsoft.com/office/drawing/2016/5/10/chartex" xmlns:cx5="http://schemas.microsoft.com/office/drawing/2016/5/11/chartex" xmlns:cx6="http://schemas.microsoft.com/office/drawing/2016/5/12/chartex" xmlns:cx7="http://schemas.microsoft.com/office/drawing/2016/5/13/chartex" xmlns:cx8="http://schemas.microsoft.com/office/drawing/2016/5/14/chartex" xmlns:mc="http://schemas.openxmlformats.org/markup-compatibility/2006" xmlns:aink="http://schemas.microsoft.com/office/drawing/2016/ink" xmlns:am3d="http://schemas.microsoft.com/office/drawing/2017/model3d" xmlns:o="urn:schemas-microsoft-com:office:office" xmlns:oel="http://schemas.microsoft.com/office/2019/extlst" xmlns:r="http://schemas.openxmlformats.org/officeDocument/2006/relationships" xmlns:m="http://schemas.openxmlformats.org/officeDocument/2006/math" xmlns:v="urn:schemas-microsoft-com:vml" xmlns:wp14="http://schemas.microsoft.com/office/word/2010/wordprocessingDrawing" xmlns:wp="http://schemas.openxmlformats.org/drawingml/2006/wordprocessingDrawing" xmlns:w10="urn:schemas-microsoft-com:office:word" xmlns:w="http://schemas.openxmlformats.org/wordprocessingml/2006/main" xmlns:w14="http://schemas.microsoft.com/office/word/2010/wordml" xmlns:w15="http://schemas.microsoft.com/office/word/2012/wordml" xmlns:w16cex="http://schemas.microsoft.com/office/word/2018/wordml/cex" xmlns:w16cid="http://schemas.microsoft.com/office/word/2016/wordml/cid" xmlns:w16="http://schemas.microsoft.com/office/word/2018/wordml" xmlns:w16du="http://schemas.microsoft.com/office/word/2023/wordml/word16du" xmlns:w16sdtdh="http://schemas.microsoft.com/office/word/2020/wordml/sdtdatahash" xmlns:w16se="http://schemas.microsoft.com/office/word/2015/wordml/symex" xmlns:wpg="http://schemas.microsoft.com/office/word/2010/wordprocessingGroup" xmlns:wpi="http://schemas.microsoft.com/office/word/2010/wordprocessingInk" xmlns:wne="http://schemas.microsoft.com/office/word/2006/wordml" xmlns:wps="http://schemas.microsoft.com/office/word/2010/wordprocessingShape" mc:Ignorable="w14 w15 w16se w16cid w16 w16cex w16sdtdh w16du wp14">
+<w:ftr xmlns:a="http://schemas.openxmlformats.org/drawingml/2006/main" xmlns:a14="http://schemas.microsoft.com/office/drawing/2010/main" xmlns:wpc="http://schemas.microsoft.com/office/word/2010/wordprocessingCanvas" xmlns:cx="http://schemas.microsoft.com/office/drawing/2014/chartex" xmlns:cx1="http://schemas.microsoft.com/office/drawing/2015/9/8/chartex" xmlns:cx2="http://schemas.microsoft.com/office/drawing/2015/10/21/chartex" xmlns:cx3="http://schemas.microsoft.com/office/drawing/2016/5/9/chartex" xmlns:cx4="http://schemas.microsoft.com/office/drawing/2016/5/10/chartex" xmlns:cx5="http://schemas.microsoft.com/office/drawing/2016/5/11/chartex" xmlns:cx6="http://schemas.microsoft.com/office/drawing/2016/5/12/chartex" xmlns:cx7="http://schemas.microsoft.com/office/drawing/2016/5/13/chartex" xmlns:cx8="http://schemas.microsoft.com/office/drawing/2016/5/14/chartex" xmlns:mc="http://schemas.openxmlformats.org/markup-compatibility/2006" xmlns:aink="http://schemas.microsoft.com/office/drawing/2016/ink" xmlns:am3d="http://schemas.microsoft.com/office/drawing/2017/model3d" xmlns:o="urn:schemas-microsoft-com:office:office" xmlns:oel="http://schemas.microsoft.com/office/2019/extlst" xmlns:r="http://schemas.openxmlformats.org/officeDocument/2006/relationships" xmlns:m="http://schemas.openxmlformats.org/officeDocument/2006/math" xmlns:v="urn:schemas-microsoft-com:vml" xmlns:wp14="http://schemas.microsoft.com/office/word/2010/wordprocessingDrawing" xmlns:wp="http://schemas.openxmlformats.org/drawingml/2006/wordprocessingDrawing" xmlns:w10="urn:schemas-microsoft-com:office:word" xmlns:w="http://schemas.openxmlformats.org/wordprocessingml/2006/main" xmlns:w14="http://schemas.microsoft.com/office/word/2010/wordml" xmlns:w15="http://schemas.microsoft.com/office/word/2012/wordml" xmlns:w16cex="http://schemas.microsoft.com/office/word/2018/wordml/cex" xmlns:w16cid="http://schemas.microsoft.com/office/word/2016/wordml/cid" xmlns:w16="http://schemas.microsoft.com/office/word/2018/wordml" xmlns:w16du="http://schemas.microsoft.com/office/word/2023/wordml/word16du" xmlns:w16sdtdh="http://schemas.microsoft.com/office/word/2020/wordml/sdtdatahash" xmlns:w16sdtfl="http://schemas.microsoft.com/office/word/2024/wordml/sdtformatlock" xmlns:w16se="http://schemas.microsoft.com/office/word/2015/wordml/symex" xmlns:wpg="http://schemas.microsoft.com/office/word/2010/wordprocessingGroup" xmlns:wpi="http://schemas.microsoft.com/office/word/2010/wordprocessingInk" xmlns:wne="http://schemas.microsoft.com/office/word/2006/wordml" xmlns:wps="http://schemas.microsoft.com/office/word/2010/wordprocessingShape" mc:Ignorable="w14 w15 w16se w16cid w16 w16cex w16sdtdh w16sdtfl w16du wp14">
   <w:p>
     <w:pPr>
       <w:pStyle w:val="Footer"/>
@@ -1856,7 +1832,7 @@
         </mc:Choice>
         <mc:Fallback>
           <w:pict>
-            <v:rect id="Rechthoek 4" style="position:absolute;margin-left:0;margin-top:0;width:539.25pt;height:717.7pt;z-index:251664384;visibility:visible;mso-wrap-style:square;mso-width-percent:1070;mso-height-percent:1050;mso-wrap-distance-left:9pt;mso-wrap-distance-top:0;mso-wrap-distance-right:9pt;mso-wrap-distance-bottom:0;mso-position-horizontal:center;mso-position-horizontal-relative:margin;mso-position-vertical:center;mso-position-vertical-relative:margin;mso-width-percent:1070;mso-height-percent:1050;mso-width-relative:margin;mso-height-relative:margin;v-text-anchor:top" o:spid="_x0000_s1026" filled="f" strokecolor="black [3213]" o:gfxdata="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" w14:anchorId="6A26A641">
+            <v:rect id="Rechthoek 4" style="position:absolute;margin-left:0;margin-top:0;width:539.25pt;height:717.7pt;z-index:251664384;visibility:visible;mso-wrap-style:square;mso-width-percent:1070;mso-height-percent:1050;mso-wrap-distance-left:9pt;mso-wrap-distance-top:0;mso-wrap-distance-right:9pt;mso-wrap-distance-bottom:0;mso-position-horizontal:center;mso-position-horizontal-relative:margin;mso-position-vertical:center;mso-position-vertical-relative:margin;mso-width-percent:1070;mso-height-percent:1050;mso-width-relative:margin;mso-height-relative:margin;v-text-anchor:top" o:spid="_x0000_s1026" filled="f" strokecolor="black [3213]" o:gfxdata="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" w14:anchorId="593312FC">
               <w10:wrap anchorx="margin" anchory="margin"/>
             </v:rect>
           </w:pict>
@@ -1956,7 +1932,7 @@
         </mc:Choice>
         <mc:Fallback>
           <w:pict>
-            <v:rect id="Rechthoek 8" style="position:absolute;margin-left:0;margin-top:0;width:10.1pt;height:495.9pt;z-index:251665408;visibility:visible;mso-wrap-style:square;mso-width-percent:20;mso-height-percent:725;mso-left-percent:1015;mso-top-percent:-25;mso-wrap-distance-left:9pt;mso-wrap-distance-top:0;mso-wrap-distance-right:9pt;mso-wrap-distance-bottom:0;mso-position-horizontal-relative:margin;mso-position-vertical-relative:margin;mso-width-percent:20;mso-height-percent:725;mso-left-percent:1015;mso-top-percent:-25;mso-width-relative:margin;mso-height-relative:margin;v-text-anchor:top" o:spid="_x0000_s1026" fillcolor="black [3213]" stroked="f" o:gfxdata="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" w14:anchorId="43FCF27C">
+            <v:rect id="Rechthoek 8" style="position:absolute;margin-left:0;margin-top:0;width:10.1pt;height:495.9pt;z-index:251665408;visibility:visible;mso-wrap-style:square;mso-width-percent:20;mso-height-percent:725;mso-left-percent:1015;mso-top-percent:-25;mso-wrap-distance-left:9pt;mso-wrap-distance-top:0;mso-wrap-distance-right:9pt;mso-wrap-distance-bottom:0;mso-position-horizontal-relative:margin;mso-position-vertical-relative:margin;mso-width-percent:20;mso-height-percent:725;mso-left-percent:1015;mso-top-percent:-25;mso-width-relative:margin;mso-height-relative:margin;v-text-anchor:top" o:spid="_x0000_s1026" fillcolor="black [3213]" stroked="f" o:gfxdata="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" w14:anchorId="7F60358F">
               <w10:wrap anchorx="margin" anchory="margin"/>
             </v:rect>
           </w:pict>
@@ -2056,7 +2032,7 @@
         </mc:Choice>
         <mc:Fallback>
           <w:pict>
-            <v:rect id="Rechthoek 9" style="position:absolute;margin-left:0;margin-top:0;width:10.1pt;height:222.3pt;z-index:251666432;visibility:visible;mso-wrap-style:square;mso-width-percent:20;mso-height-percent:325;mso-left-percent:1015;mso-top-percent:700;mso-wrap-distance-left:9pt;mso-wrap-distance-top:0;mso-wrap-distance-right:9pt;mso-wrap-distance-bottom:0;mso-position-horizontal-relative:margin;mso-position-vertical-relative:margin;mso-width-percent:20;mso-height-percent:325;mso-left-percent:1015;mso-top-percent:700;mso-width-relative:margin;mso-height-relative:margin;v-text-anchor:top" o:spid="_x0000_s1026" fillcolor="#d1282e [3215]" stroked="f" o:gfxdata="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" w14:anchorId="5BB5FEEF">
+            <v:rect id="Rechthoek 9" style="position:absolute;margin-left:0;margin-top:0;width:10.1pt;height:222.3pt;z-index:251666432;visibility:visible;mso-wrap-style:square;mso-width-percent:20;mso-height-percent:325;mso-left-percent:1015;mso-top-percent:700;mso-wrap-distance-left:9pt;mso-wrap-distance-top:0;mso-wrap-distance-right:9pt;mso-wrap-distance-bottom:0;mso-position-horizontal-relative:margin;mso-position-vertical-relative:margin;mso-width-percent:20;mso-height-percent:325;mso-left-percent:1015;mso-top-percent:700;mso-width-relative:margin;mso-height-relative:margin;v-text-anchor:top" o:spid="_x0000_s1026" fillcolor="#d1282e [3215]" stroked="f" o:gfxdata="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" w14:anchorId="42C8D460">
               <w10:wrap anchorx="margin" anchory="margin"/>
             </v:rect>
           </w:pict>
@@ -2068,7 +2044,7 @@
 </file>
 
 <file path=word/footnotes.xml><?xml version="1.0" encoding="utf-8"?>
-<w:footnotes xmlns:wpc="http://schemas.microsoft.com/office/word/2010/wordprocessingCanvas" xmlns:cx="http://schemas.microsoft.com/office/drawing/2014/chartex" xmlns:cx1="http://schemas.microsoft.com/office/drawing/2015/9/8/chartex" xmlns:cx2="http://schemas.microsoft.com/office/drawing/2015/10/21/chartex" xmlns:cx3="http://schemas.microsoft.com/office/drawing/2016/5/9/chartex" xmlns:cx4="http://schemas.microsoft.com/office/drawing/2016/5/10/chartex" xmlns:cx5="http://schemas.microsoft.com/office/drawing/2016/5/11/chartex" xmlns:cx6="http://schemas.microsoft.com/office/drawing/2016/5/12/chartex" xmlns:cx7="http://schemas.microsoft.com/office/drawing/2016/5/13/chartex" xmlns:cx8="http://schemas.microsoft.com/office/drawing/2016/5/14/chartex" xmlns:mc="http://schemas.openxmlformats.org/markup-compatibility/2006" xmlns:aink="http://schemas.microsoft.com/office/drawing/2016/ink" xmlns:am3d="http://schemas.microsoft.com/office/drawing/2017/model3d" xmlns:o="urn:schemas-microsoft-com:office:office" xmlns:oel="http://schemas.microsoft.com/office/2019/extlst" xmlns:r="http://schemas.openxmlformats.org/officeDocument/2006/relationships" xmlns:m="http://schemas.openxmlformats.org/officeDocument/2006/math" xmlns:v="urn:schemas-microsoft-com:vml" xmlns:wp14="http://schemas.microsoft.com/office/word/2010/wordprocessingDrawing" xmlns:wp="http://schemas.openxmlformats.org/drawingml/2006/wordprocessingDrawing" xmlns:w10="urn:schemas-microsoft-com:office:word" xmlns:w="http://schemas.openxmlformats.org/wordprocessingml/2006/main" xmlns:w14="http://schemas.microsoft.com/office/word/2010/wordml" xmlns:w15="http://schemas.microsoft.com/office/word/2012/wordml" xmlns:w16cex="http://schemas.microsoft.com/office/word/2018/wordml/cex" xmlns:w16cid="http://schemas.microsoft.com/office/word/2016/wordml/cid" xmlns:w16="http://schemas.microsoft.com/office/word/2018/wordml" xmlns:w16du="http://schemas.microsoft.com/office/word/2023/wordml/word16du" xmlns:w16sdtdh="http://schemas.microsoft.com/office/word/2020/wordml/sdtdatahash" xmlns:w16se="http://schemas.microsoft.com/office/word/2015/wordml/symex" xmlns:wpg="http://schemas.microsoft.com/office/word/2010/wordprocessingGroup" xmlns:wpi="http://schemas.microsoft.com/office/word/2010/wordprocessingInk" xmlns:wne="http://schemas.microsoft.com/office/word/2006/wordml" xmlns:wps="http://schemas.microsoft.com/office/word/2010/wordprocessingShape" mc:Ignorable="w14 w15 w16se w16cid w16 w16cex w16sdtdh w16du wp14">
+<w:footnotes xmlns:wpc="http://schemas.microsoft.com/office/word/2010/wordprocessingCanvas" xmlns:cx="http://schemas.microsoft.com/office/drawing/2014/chartex" xmlns:cx1="http://schemas.microsoft.com/office/drawing/2015/9/8/chartex" xmlns:cx2="http://schemas.microsoft.com/office/drawing/2015/10/21/chartex" xmlns:cx3="http://schemas.microsoft.com/office/drawing/2016/5/9/chartex" xmlns:cx4="http://schemas.microsoft.com/office/drawing/2016/5/10/chartex" xmlns:cx5="http://schemas.microsoft.com/office/drawing/2016/5/11/chartex" xmlns:cx6="http://schemas.microsoft.com/office/drawing/2016/5/12/chartex" xmlns:cx7="http://schemas.microsoft.com/office/drawing/2016/5/13/chartex" xmlns:cx8="http://schemas.microsoft.com/office/drawing/2016/5/14/chartex" xmlns:mc="http://schemas.openxmlformats.org/markup-compatibility/2006" xmlns:aink="http://schemas.microsoft.com/office/drawing/2016/ink" xmlns:am3d="http://schemas.microsoft.com/office/drawing/2017/model3d" xmlns:o="urn:schemas-microsoft-com:office:office" xmlns:oel="http://schemas.microsoft.com/office/2019/extlst" xmlns:r="http://schemas.openxmlformats.org/officeDocument/2006/relationships" xmlns:m="http://schemas.openxmlformats.org/officeDocument/2006/math" xmlns:v="urn:schemas-microsoft-com:vml" xmlns:wp14="http://schemas.microsoft.com/office/word/2010/wordprocessingDrawing" xmlns:wp="http://schemas.openxmlformats.org/drawingml/2006/wordprocessingDrawing" xmlns:w10="urn:schemas-microsoft-com:office:word" xmlns:w="http://schemas.openxmlformats.org/wordprocessingml/2006/main" xmlns:w14="http://schemas.microsoft.com/office/word/2010/wordml" xmlns:w15="http://schemas.microsoft.com/office/word/2012/wordml" xmlns:w16cex="http://schemas.microsoft.com/office/word/2018/wordml/cex" xmlns:w16cid="http://schemas.microsoft.com/office/word/2016/wordml/cid" xmlns:w16="http://schemas.microsoft.com/office/word/2018/wordml" xmlns:w16du="http://schemas.microsoft.com/office/word/2023/wordml/word16du" xmlns:w16sdtdh="http://schemas.microsoft.com/office/word/2020/wordml/sdtdatahash" xmlns:w16sdtfl="http://schemas.microsoft.com/office/word/2024/wordml/sdtformatlock" xmlns:w16se="http://schemas.microsoft.com/office/word/2015/wordml/symex" xmlns:wpg="http://schemas.microsoft.com/office/word/2010/wordprocessingGroup" xmlns:wpi="http://schemas.microsoft.com/office/word/2010/wordprocessingInk" xmlns:wne="http://schemas.microsoft.com/office/word/2006/wordml" xmlns:wps="http://schemas.microsoft.com/office/word/2010/wordprocessingShape" mc:Ignorable="w14 w15 w16se w16cid w16 w16cex w16sdtdh w16sdtfl w16du wp14">
   <w:footnote w:type="separator" w:id="-1">
     <w:p>
       <w:pPr>
@@ -2093,7 +2069,7 @@
 </file>
 
 <file path=word/styles.xml><?xml version="1.0" encoding="utf-8"?>
-<w:styles xmlns:mc="http://schemas.openxmlformats.org/markup-compatibility/2006" xmlns:r="http://schemas.openxmlformats.org/officeDocument/2006/relationships" xmlns:w="http://schemas.openxmlformats.org/wordprocessingml/2006/main" xmlns:w14="http://schemas.microsoft.com/office/word/2010/wordml" xmlns:w15="http://schemas.microsoft.com/office/word/2012/wordml" xmlns:w16cex="http://schemas.microsoft.com/office/word/2018/wordml/cex" xmlns:w16cid="http://schemas.microsoft.com/office/word/2016/wordml/cid" xmlns:w16="http://schemas.microsoft.com/office/word/2018/wordml" xmlns:w16du="http://schemas.microsoft.com/office/word/2023/wordml/word16du" xmlns:w16sdtdh="http://schemas.microsoft.com/office/word/2020/wordml/sdtdatahash" xmlns:w16se="http://schemas.microsoft.com/office/word/2015/wordml/symex" mc:Ignorable="w14 w15 w16se w16cid w16 w16cex w16sdtdh w16du">
+<w:styles xmlns:mc="http://schemas.openxmlformats.org/markup-compatibility/2006" xmlns:r="http://schemas.openxmlformats.org/officeDocument/2006/relationships" xmlns:w="http://schemas.openxmlformats.org/wordprocessingml/2006/main" xmlns:w14="http://schemas.microsoft.com/office/word/2010/wordml" xmlns:w15="http://schemas.microsoft.com/office/word/2012/wordml" xmlns:w16cex="http://schemas.microsoft.com/office/word/2018/wordml/cex" xmlns:w16cid="http://schemas.microsoft.com/office/word/2016/wordml/cid" xmlns:w16="http://schemas.microsoft.com/office/word/2018/wordml" xmlns:w16du="http://schemas.microsoft.com/office/word/2023/wordml/word16du" xmlns:w16sdtdh="http://schemas.microsoft.com/office/word/2020/wordml/sdtdatahash" xmlns:w16sdtfl="http://schemas.microsoft.com/office/word/2024/wordml/sdtformatlock" xmlns:w16se="http://schemas.microsoft.com/office/word/2015/wordml/symex" mc:Ignorable="w14 w15 w16se w16cid w16 w16cex w16sdtdh w16sdtfl w16du">
   <w:docDefaults>
     <w:rPrDefault>
       <w:rPr>

</xml_diff>